<commit_message>
Deploy preview for PR 65 🛫
</commit_message>
<xml_diff>
--- a/pr-preview/pr-65/vignettes/articles/quarto_article.docx
+++ b/pr-preview/pr-65/vignettes/articles/quarto_article.docx
@@ -57,7 +57,7 @@
         <w:pStyle w:val="FirstParagraph"/>
       </w:pPr>
       <w:r>
-        <w:t xml:space="preserve">This article demonstrates advanced features of Quarto for pkgdown articles. Unlike vignettes, articles are only available on the pkgdown website and are not included in the package bundle.</w:t>
+        <w:t xml:space="preserve">This article demonstrates advanced features of Quarto for package documentation. Unlike vignettes, articles are only available on the documentation website and are not included in the package bundle.</w:t>
       </w:r>
     </w:p>
     <w:bookmarkEnd w:id="20"/>
@@ -3709,7 +3709,7 @@
         <w:pStyle w:val="FirstParagraph"/>
       </w:pPr>
       <w:r>
-        <w:t xml:space="preserve">This article demonstrates the advanced capabilities of Quarto for creating rich, interactive documentation for R packages. The integration with pkgdown makes it easy to create professional package websites.</w:t>
+        <w:t xml:space="preserve">This article demonstrates the advanced capabilities of Quarto for creating rich, interactive documentation for R packages.</w:t>
       </w:r>
     </w:p>
     <w:bookmarkEnd w:id="54"/>

</xml_diff>